<commit_message>
Update Task 2 documentation and JSON
</commit_message>
<xml_diff>
--- a/Documentation.docx
+++ b/Documentation.docx
@@ -35,7 +35,7 @@
                     <pic:cNvPicPr/>
                   </pic:nvPicPr>
                   <pic:blipFill>
-                    <a:blip r:embed="rId5"/>
+                    <a:blip r:embed="rId6"/>
                     <a:stretch>
                       <a:fillRect/>
                     </a:stretch>
@@ -67,8 +67,6 @@
       <w:r>
         <w:t>Create your username branch</w:t>
       </w:r>
-      <w:bookmarkStart w:id="0" w:name="_GoBack"/>
-      <w:bookmarkEnd w:id="0"/>
     </w:p>
     <w:p>
       <w:pPr>
@@ -91,7 +89,7 @@
                     <pic:cNvPicPr/>
                   </pic:nvPicPr>
                   <pic:blipFill>
-                    <a:blip r:embed="rId6"/>
+                    <a:blip r:embed="rId7"/>
                     <a:stretch>
                       <a:fillRect/>
                     </a:stretch>
@@ -116,6 +114,178 @@
       <w:pPr>
         <w:ind w:left="720"/>
       </w:pPr>
+    </w:p>
+    <w:p>
+      <w:pPr>
+        <w:ind w:left="720"/>
+      </w:pPr>
+    </w:p>
+    <w:p>
+      <w:pPr>
+        <w:ind w:left="720"/>
+      </w:pPr>
+    </w:p>
+    <w:p>
+      <w:pPr>
+        <w:ind w:left="720"/>
+      </w:pPr>
+    </w:p>
+    <w:p>
+      <w:pPr>
+        <w:ind w:left="720"/>
+      </w:pPr>
+    </w:p>
+    <w:p>
+      <w:pPr>
+        <w:pStyle w:val="ListParagraph"/>
+        <w:numPr>
+          <w:ilvl w:val="0"/>
+          <w:numId w:val="1"/>
+        </w:numPr>
+        <w:rPr>
+          <w:rStyle w:val="HTMLCode"/>
+          <w:rFonts w:asciiTheme="minorHAnsi" w:eastAsiaTheme="minorHAnsi" w:hAnsiTheme="minorHAnsi" w:cstheme="minorBidi"/>
+          <w:sz w:val="22"/>
+          <w:szCs w:val="22"/>
+        </w:rPr>
+      </w:pPr>
+      <w:r>
+        <w:lastRenderedPageBreak/>
+        <w:t xml:space="preserve">Conflict markers in </w:t>
+      </w:r>
+      <w:proofErr w:type="spellStart"/>
+      <w:r>
+        <w:rPr>
+          <w:rStyle w:val="HTMLCode"/>
+          <w:rFonts w:eastAsiaTheme="minorHAnsi"/>
+        </w:rPr>
+        <w:t>data.json</w:t>
+      </w:r>
+      <w:proofErr w:type="spellEnd"/>
+      <w:r>
+        <w:drawing>
+          <wp:inline distT="0" distB="0" distL="0" distR="0" wp14:anchorId="4E8DF382" wp14:editId="02DCAD22">
+            <wp:extent cx="5731510" cy="3217545"/>
+            <wp:effectExtent l="0" t="0" r="2540" b="1905"/>
+            <wp:docPr id="3" name="Picture 3"/>
+            <wp:cNvGraphicFramePr>
+              <a:graphicFrameLocks xmlns:a="http://schemas.openxmlformats.org/drawingml/2006/main" noChangeAspect="1"/>
+            </wp:cNvGraphicFramePr>
+            <a:graphic xmlns:a="http://schemas.openxmlformats.org/drawingml/2006/main">
+              <a:graphicData uri="http://schemas.openxmlformats.org/drawingml/2006/picture">
+                <pic:pic xmlns:pic="http://schemas.openxmlformats.org/drawingml/2006/picture">
+                  <pic:nvPicPr>
+                    <pic:cNvPr id="1" name=""/>
+                    <pic:cNvPicPr/>
+                  </pic:nvPicPr>
+                  <pic:blipFill>
+                    <a:blip r:embed="rId8"/>
+                    <a:stretch>
+                      <a:fillRect/>
+                    </a:stretch>
+                  </pic:blipFill>
+                  <pic:spPr>
+                    <a:xfrm>
+                      <a:off x="0" y="0"/>
+                      <a:ext cx="5731510" cy="3217545"/>
+                    </a:xfrm>
+                    <a:prstGeom prst="rect">
+                      <a:avLst/>
+                    </a:prstGeom>
+                  </pic:spPr>
+                </pic:pic>
+              </a:graphicData>
+            </a:graphic>
+          </wp:inline>
+        </w:drawing>
+      </w:r>
+    </w:p>
+    <w:p>
+      <w:r>
+        <w:drawing>
+          <wp:inline distT="0" distB="0" distL="0" distR="0" wp14:anchorId="5503B07F" wp14:editId="1A2FF4C3">
+            <wp:extent cx="5731510" cy="3304540"/>
+            <wp:effectExtent l="0" t="0" r="2540" b="0"/>
+            <wp:docPr id="4" name="Picture 4"/>
+            <wp:cNvGraphicFramePr>
+              <a:graphicFrameLocks xmlns:a="http://schemas.openxmlformats.org/drawingml/2006/main" noChangeAspect="1"/>
+            </wp:cNvGraphicFramePr>
+            <a:graphic xmlns:a="http://schemas.openxmlformats.org/drawingml/2006/main">
+              <a:graphicData uri="http://schemas.openxmlformats.org/drawingml/2006/picture">
+                <pic:pic xmlns:pic="http://schemas.openxmlformats.org/drawingml/2006/picture">
+                  <pic:nvPicPr>
+                    <pic:cNvPr id="1" name=""/>
+                    <pic:cNvPicPr/>
+                  </pic:nvPicPr>
+                  <pic:blipFill>
+                    <a:blip r:embed="rId9"/>
+                    <a:stretch>
+                      <a:fillRect/>
+                    </a:stretch>
+                  </pic:blipFill>
+                  <pic:spPr>
+                    <a:xfrm>
+                      <a:off x="0" y="0"/>
+                      <a:ext cx="5731510" cy="3304540"/>
+                    </a:xfrm>
+                    <a:prstGeom prst="rect">
+                      <a:avLst/>
+                    </a:prstGeom>
+                  </pic:spPr>
+                </pic:pic>
+              </a:graphicData>
+            </a:graphic>
+          </wp:inline>
+        </w:drawing>
+      </w:r>
+    </w:p>
+    <w:p>
+      <w:r>
+        <w:lastRenderedPageBreak/>
+        <w:br/>
+      </w:r>
+      <w:r>
+        <w:br/>
+      </w:r>
+      <w:r>
+        <w:drawing>
+          <wp:inline distT="0" distB="0" distL="0" distR="0" wp14:anchorId="2CDADA0D" wp14:editId="714E3934">
+            <wp:extent cx="5731510" cy="3227070"/>
+            <wp:effectExtent l="0" t="0" r="2540" b="0"/>
+            <wp:docPr id="5" name="Picture 5"/>
+            <wp:cNvGraphicFramePr>
+              <a:graphicFrameLocks xmlns:a="http://schemas.openxmlformats.org/drawingml/2006/main" noChangeAspect="1"/>
+            </wp:cNvGraphicFramePr>
+            <a:graphic xmlns:a="http://schemas.openxmlformats.org/drawingml/2006/main">
+              <a:graphicData uri="http://schemas.openxmlformats.org/drawingml/2006/picture">
+                <pic:pic xmlns:pic="http://schemas.openxmlformats.org/drawingml/2006/picture">
+                  <pic:nvPicPr>
+                    <pic:cNvPr id="1" name=""/>
+                    <pic:cNvPicPr/>
+                  </pic:nvPicPr>
+                  <pic:blipFill>
+                    <a:blip r:embed="rId10"/>
+                    <a:stretch>
+                      <a:fillRect/>
+                    </a:stretch>
+                  </pic:blipFill>
+                  <pic:spPr>
+                    <a:xfrm>
+                      <a:off x="0" y="0"/>
+                      <a:ext cx="5731510" cy="3227070"/>
+                    </a:xfrm>
+                    <a:prstGeom prst="rect">
+                      <a:avLst/>
+                    </a:prstGeom>
+                  </pic:spPr>
+                </pic:pic>
+              </a:graphicData>
+            </a:graphic>
+          </wp:inline>
+        </w:drawing>
+      </w:r>
+      <w:bookmarkStart w:id="0" w:name="_GoBack"/>
+      <w:bookmarkEnd w:id="0"/>
     </w:p>
     <w:sectPr>
       <w:pgSz w:w="11906" w:h="16838"/>
@@ -656,6 +826,19 @@
       <w:contextualSpacing/>
     </w:pPr>
   </w:style>
+  <w:style w:type="character" w:styleId="HTMLCode">
+    <w:name w:val="HTML Code"/>
+    <w:basedOn w:val="DefaultParagraphFont"/>
+    <w:uiPriority w:val="99"/>
+    <w:semiHidden/>
+    <w:unhideWhenUsed/>
+    <w:rsid w:val="00C154FA"/>
+    <w:rPr>
+      <w:rFonts w:ascii="Courier New" w:eastAsia="Times New Roman" w:hAnsi="Courier New" w:cs="Courier New"/>
+      <w:sz w:val="20"/>
+      <w:szCs w:val="20"/>
+    </w:rPr>
+  </w:style>
 </w:styles>
 </file>
 
@@ -918,4 +1101,16 @@
     </a:ext>
   </a:extLst>
 </a:theme>
+</file>
+
+<file path=customXml/item1.xml><?xml version="1.0" encoding="utf-8"?>
+<b:Sources xmlns:b="http://schemas.openxmlformats.org/officeDocument/2006/bibliography" xmlns="http://schemas.openxmlformats.org/officeDocument/2006/bibliography" SelectedStyle="\APASixthEditionOfficeOnline.xsl" StyleName="APA" Version="6"/>
+</file>
+
+<file path=customXml/itemProps1.xml><?xml version="1.0" encoding="utf-8"?>
+<ds:datastoreItem xmlns:ds="http://schemas.openxmlformats.org/officeDocument/2006/customXml" ds:itemID="{E6EA667A-7FA4-4BF1-84C8-96E20223EC92}">
+  <ds:schemaRefs>
+    <ds:schemaRef ds:uri="http://schemas.openxmlformats.org/officeDocument/2006/bibliography"/>
+  </ds:schemaRefs>
+</ds:datastoreItem>
 </file>
</xml_diff>